<commit_message>
Response added in wk11 discussion
</commit_message>
<xml_diff>
--- a/WK11_Discussion.docx
+++ b/WK11_Discussion.docx
@@ -964,6 +964,160 @@
     </w:p>
     <w:p>
       <w:pPr>
+        <w:pStyle w:val="NormalWeb"/>
+        <w:spacing w:before="180" w:beforeAutospacing="0" w:after="180" w:afterAutospacing="0" w:line="480" w:lineRule="auto"/>
+        <w:jc w:val="both"/>
+        <w:rPr>
+          <w:rFonts w:ascii="Lato" w:hAnsi="Lato"/>
+          <w:color w:val="444444"/>
+        </w:rPr>
+      </w:pPr>
+      <w:r>
+        <w:rPr>
+          <w:rFonts w:ascii="Lato" w:hAnsi="Lato"/>
+          <w:color w:val="444444"/>
+        </w:rPr>
+        <w:t xml:space="preserve">Hello </w:t>
+      </w:r>
+      <w:proofErr w:type="spellStart"/>
+      <w:r>
+        <w:rPr>
+          <w:rFonts w:ascii="Lato" w:hAnsi="Lato"/>
+          <w:color w:val="444444"/>
+        </w:rPr>
+        <w:t>Navjeet</w:t>
+      </w:r>
+      <w:proofErr w:type="spellEnd"/>
+    </w:p>
+    <w:p>
+      <w:pPr>
+        <w:pStyle w:val="NormalWeb"/>
+        <w:spacing w:before="180" w:beforeAutospacing="0" w:after="180" w:afterAutospacing="0" w:line="480" w:lineRule="auto"/>
+        <w:jc w:val="both"/>
+        <w:rPr>
+          <w:rFonts w:ascii="Lato" w:hAnsi="Lato"/>
+          <w:color w:val="444444"/>
+        </w:rPr>
+      </w:pPr>
+      <w:r>
+        <w:rPr>
+          <w:rFonts w:ascii="Lato" w:hAnsi="Lato"/>
+          <w:color w:val="444444"/>
+        </w:rPr>
+        <w:t>Thank you for the post. Along with the strategy you have presented, implementing robust access control can guarantee that only authorized individuals can access sensitive information. According to Front Egg, Role-based Access Control (RBAC) is a method for restricting network access based on the roles of individual users. It allows employees to access only the information they need to do their job. Role-based access controls (RBAC) limit access to data based on an individual's role within the organization. Together with RBAC, a Multi-factor authentication (MFA) adds one more layer of security by requiring users to provide numerous types of verification before accessing data.</w:t>
+      </w:r>
+    </w:p>
+    <w:p>
+      <w:pPr>
+        <w:pStyle w:val="NormalWeb"/>
+        <w:spacing w:before="180" w:beforeAutospacing="0" w:after="180" w:afterAutospacing="0" w:line="480" w:lineRule="auto"/>
+        <w:jc w:val="both"/>
+        <w:rPr>
+          <w:rFonts w:ascii="Lato" w:hAnsi="Lato"/>
+          <w:color w:val="444444"/>
+        </w:rPr>
+      </w:pPr>
+      <w:r>
+        <w:rPr>
+          <w:rFonts w:ascii="Lato" w:hAnsi="Lato"/>
+          <w:color w:val="444444"/>
+        </w:rPr>
+        <w:t> </w:t>
+      </w:r>
+    </w:p>
+    <w:p>
+      <w:pPr>
+        <w:pStyle w:val="NormalWeb"/>
+        <w:spacing w:before="180" w:beforeAutospacing="0" w:after="180" w:afterAutospacing="0" w:line="480" w:lineRule="auto"/>
+        <w:jc w:val="both"/>
+        <w:rPr>
+          <w:rFonts w:ascii="Lato" w:hAnsi="Lato"/>
+          <w:color w:val="444444"/>
+        </w:rPr>
+      </w:pPr>
+      <w:r>
+        <w:rPr>
+          <w:rStyle w:val="Strong"/>
+          <w:rFonts w:ascii="Lato" w:hAnsi="Lato"/>
+          <w:color w:val="444444"/>
+        </w:rPr>
+        <w:t>References:</w:t>
+      </w:r>
+    </w:p>
+    <w:p>
+      <w:pPr>
+        <w:pStyle w:val="NormalWeb"/>
+        <w:spacing w:before="180" w:beforeAutospacing="0" w:after="180" w:afterAutospacing="0" w:line="480" w:lineRule="auto"/>
+        <w:jc w:val="both"/>
+        <w:rPr>
+          <w:rFonts w:ascii="Lato" w:hAnsi="Lato"/>
+          <w:color w:val="444444"/>
+        </w:rPr>
+      </w:pPr>
+      <w:r>
+        <w:rPr>
+          <w:rStyle w:val="Emphasis"/>
+          <w:rFonts w:ascii="Lato" w:hAnsi="Lato"/>
+          <w:color w:val="444444"/>
+        </w:rPr>
+        <w:t>What is role-based access control (RBAC)? A complete guide</w:t>
+      </w:r>
+      <w:r>
+        <w:rPr>
+          <w:rFonts w:ascii="Lato" w:hAnsi="Lato"/>
+          <w:color w:val="444444"/>
+        </w:rPr>
+        <w:t xml:space="preserve">. </w:t>
+      </w:r>
+      <w:proofErr w:type="spellStart"/>
+      <w:r>
+        <w:rPr>
+          <w:rFonts w:ascii="Lato" w:hAnsi="Lato"/>
+          <w:color w:val="444444"/>
+        </w:rPr>
+        <w:t>Frontegg</w:t>
+      </w:r>
+      <w:proofErr w:type="spellEnd"/>
+      <w:r>
+        <w:rPr>
+          <w:rFonts w:ascii="Lato" w:hAnsi="Lato"/>
+          <w:color w:val="444444"/>
+        </w:rPr>
+        <w:t>. (2025, April 16).</w:t>
+      </w:r>
+    </w:p>
+    <w:p>
+      <w:pPr>
+        <w:pStyle w:val="NormalWeb"/>
+        <w:spacing w:before="0" w:beforeAutospacing="0" w:after="0" w:afterAutospacing="0" w:line="480" w:lineRule="auto"/>
+        <w:jc w:val="both"/>
+        <w:rPr>
+          <w:rFonts w:ascii="Lato" w:hAnsi="Lato"/>
+          <w:color w:val="444444"/>
+        </w:rPr>
+      </w:pPr>
+      <w:hyperlink r:id="rId11" w:tgtFrame="_blank" w:history="1">
+        <w:r>
+          <w:rPr>
+            <w:rStyle w:val="Hyperlink"/>
+            <w:rFonts w:ascii="Lato" w:hAnsi="Lato"/>
+          </w:rPr>
+          <w:t>https://frontegg.com/guides/rbac</w:t>
+        </w:r>
+        <w:r>
+          <w:rPr>
+            <w:rStyle w:val="screenreader-only"/>
+            <w:rFonts w:ascii="Lato" w:hAnsi="Lato"/>
+            <w:color w:val="0000FF"/>
+            <w:u w:val="single"/>
+            <w:bdr w:val="none" w:sz="0" w:space="0" w:color="auto" w:frame="1"/>
+          </w:rPr>
+          <w:t>Links to an external site.</w:t>
+        </w:r>
+      </w:hyperlink>
+    </w:p>
+    <w:p>
+      <w:pPr>
         <w:spacing w:before="180" w:after="180" w:line="480" w:lineRule="auto"/>
         <w:jc w:val="both"/>
         <w:rPr>
@@ -974,9 +1128,21 @@
         </w:rPr>
       </w:pPr>
     </w:p>
+    <w:p>
+      <w:pPr>
+        <w:spacing w:before="180" w:after="180" w:line="480" w:lineRule="auto"/>
+        <w:jc w:val="both"/>
+        <w:rPr>
+          <w:rFonts w:ascii="Times New Roman" w:eastAsia="Times New Roman" w:hAnsi="Times New Roman" w:cs="Times New Roman"/>
+          <w:b/>
+          <w:bCs/>
+          <w:color w:val="2D3B45"/>
+        </w:rPr>
+      </w:pPr>
+    </w:p>
     <w:sectPr>
-      <w:footerReference w:type="even" r:id="rId11"/>
-      <w:footerReference w:type="default" r:id="rId12"/>
+      <w:footerReference w:type="even" r:id="rId12"/>
+      <w:footerReference w:type="default" r:id="rId13"/>
       <w:pgSz w:w="12240" w:h="15840"/>
       <w:pgMar w:top="1440" w:right="1440" w:bottom="1440" w:left="1440" w:header="720" w:footer="720" w:gutter="0"/>
       <w:pgNumType w:start="0"/>

</xml_diff>